<commit_message>
Toques finais para entrega do dia 21/10/2026
</commit_message>
<xml_diff>
--- a/TCC-Revisado-29.09.docx
+++ b/TCC-Revisado-29.09.docx
@@ -2098,6 +2098,7 @@
         <w:spacing w:before="240" w:after="240" w:line="360" w:lineRule="auto"/>
         <w:jc w:val="both"/>
         <w:rPr>
+          <w:rFonts w:hint="eastAsia"/>
           <w:lang w:val="en-US"/>
         </w:rPr>
       </w:pPr>
@@ -2309,6 +2310,9 @@
         <w:pStyle w:val="Text"/>
         <w:spacing w:line="240" w:lineRule="auto"/>
         <w:ind w:firstLine="0"/>
+        <w:rPr>
+          <w:lang w:val="en-US"/>
+        </w:rPr>
       </w:pPr>
     </w:p>
     <w:p>
@@ -2318,20 +2322,7 @@
       </w:pPr>
       <w:r>
         <w:lastRenderedPageBreak/>
-        <w:t xml:space="preserve">LISTA DE </w:t>
-      </w:r>
-      <w:r>
-        <w:rPr>
-          <w:lang w:val="en-US"/>
-        </w:rPr>
-        <w:t xml:space="preserve">figuras </w:t>
-      </w:r>
-      <w:r>
-        <w:rPr>
-          <w:b w:val="0"/>
-          <w:color w:val="FF0000"/>
-        </w:rPr>
-        <w:t>(opcional)</w:t>
+        <w:t>LISTA DE FIGURAS</w:t>
       </w:r>
     </w:p>
     <w:p>
@@ -2339,6 +2330,7 @@
         <w:pStyle w:val="Text"/>
         <w:ind w:firstLine="0"/>
         <w:rPr>
+          <w:szCs w:val="24"/>
           <w:lang w:val="en-US"/>
         </w:rPr>
       </w:pPr>
@@ -2372,12 +2364,16 @@
           </w:tcPr>
           <w:p>
             <w:pPr>
-              <w:pStyle w:val="Text"/>
-              <w:spacing w:before="57" w:after="57"/>
-              <w:ind w:firstLine="0"/>
+              <w:spacing w:line="360" w:lineRule="auto"/>
+              <w:rPr>
+                <w:rFonts w:ascii="Arial" w:hAnsi="Arial"/>
+              </w:rPr>
             </w:pPr>
             <w:r>
-              <w:t xml:space="preserve">Figura 1 –    </w:t>
+              <w:rPr>
+                <w:rFonts w:ascii="Arial" w:hAnsi="Arial"/>
+              </w:rPr>
+              <w:t>Figura 1 –</w:t>
             </w:r>
           </w:p>
         </w:tc>
@@ -2393,12 +2389,16 @@
           </w:tcPr>
           <w:p>
             <w:pPr>
-              <w:pStyle w:val="Text"/>
-              <w:spacing w:before="57" w:after="57"/>
-              <w:ind w:firstLine="0"/>
+              <w:spacing w:line="360" w:lineRule="auto"/>
+              <w:rPr>
+                <w:rFonts w:ascii="Arial" w:hAnsi="Arial"/>
+              </w:rPr>
             </w:pPr>
             <w:r>
-              <w:t>Título da Figura.............................................................................</w:t>
+              <w:rPr>
+                <w:rFonts w:ascii="Arial" w:hAnsi="Arial"/>
+              </w:rPr>
+              <w:t>Tela inicial – protótipo</w:t>
             </w:r>
           </w:p>
         </w:tc>
@@ -2414,12 +2414,16 @@
           </w:tcPr>
           <w:p>
             <w:pPr>
-              <w:pStyle w:val="Text"/>
-              <w:spacing w:before="57" w:after="57"/>
-              <w:ind w:firstLine="0"/>
+              <w:spacing w:line="360" w:lineRule="auto"/>
+              <w:rPr>
+                <w:rFonts w:ascii="Arial" w:hAnsi="Arial"/>
+              </w:rPr>
             </w:pPr>
             <w:r>
-              <w:t>11</w:t>
+              <w:rPr>
+                <w:rFonts w:ascii="Arial" w:hAnsi="Arial"/>
+              </w:rPr>
+              <w:t>47</w:t>
             </w:r>
           </w:p>
         </w:tc>
@@ -2437,11 +2441,15 @@
           </w:tcPr>
           <w:p>
             <w:pPr>
-              <w:pStyle w:val="Text"/>
-              <w:spacing w:before="57" w:after="57"/>
-              <w:ind w:firstLine="0"/>
+              <w:spacing w:line="360" w:lineRule="auto"/>
+              <w:rPr>
+                <w:rFonts w:ascii="Arial" w:hAnsi="Arial"/>
+              </w:rPr>
             </w:pPr>
             <w:r>
+              <w:rPr>
+                <w:rFonts w:ascii="Arial" w:hAnsi="Arial"/>
+              </w:rPr>
               <w:t>Figura 2 –</w:t>
             </w:r>
           </w:p>
@@ -2458,12 +2466,16 @@
           </w:tcPr>
           <w:p>
             <w:pPr>
-              <w:pStyle w:val="Text"/>
-              <w:spacing w:before="57" w:after="57"/>
-              <w:ind w:firstLine="0"/>
+              <w:spacing w:line="360" w:lineRule="auto"/>
+              <w:rPr>
+                <w:rFonts w:ascii="Arial" w:hAnsi="Arial"/>
+              </w:rPr>
             </w:pPr>
             <w:r>
-              <w:t>Título da Figura.............................................................................</w:t>
+              <w:rPr>
+                <w:rFonts w:ascii="Arial" w:hAnsi="Arial"/>
+              </w:rPr>
+              <w:t>Tela inicial com imagem</w:t>
             </w:r>
           </w:p>
         </w:tc>
@@ -2479,12 +2491,16 @@
           </w:tcPr>
           <w:p>
             <w:pPr>
-              <w:pStyle w:val="Text"/>
-              <w:spacing w:before="57" w:after="57"/>
-              <w:ind w:firstLine="0"/>
+              <w:spacing w:line="360" w:lineRule="auto"/>
+              <w:rPr>
+                <w:rFonts w:ascii="Arial" w:hAnsi="Arial"/>
+              </w:rPr>
             </w:pPr>
             <w:r>
-              <w:t>12</w:t>
+              <w:rPr>
+                <w:rFonts w:ascii="Arial" w:hAnsi="Arial"/>
+              </w:rPr>
+              <w:t>48</w:t>
             </w:r>
           </w:p>
         </w:tc>
@@ -2502,11 +2518,15 @@
           </w:tcPr>
           <w:p>
             <w:pPr>
-              <w:pStyle w:val="Text"/>
-              <w:spacing w:before="57" w:after="57"/>
-              <w:ind w:firstLine="0"/>
+              <w:spacing w:line="360" w:lineRule="auto"/>
+              <w:rPr>
+                <w:rFonts w:ascii="Arial" w:hAnsi="Arial"/>
+              </w:rPr>
             </w:pPr>
             <w:r>
+              <w:rPr>
+                <w:rFonts w:ascii="Arial" w:hAnsi="Arial"/>
+              </w:rPr>
               <w:t>Figura 3 –</w:t>
             </w:r>
           </w:p>
@@ -2523,12 +2543,16 @@
           </w:tcPr>
           <w:p>
             <w:pPr>
-              <w:pStyle w:val="Text"/>
-              <w:spacing w:before="57" w:after="57"/>
-              <w:ind w:firstLine="0"/>
+              <w:spacing w:line="360" w:lineRule="auto"/>
+              <w:rPr>
+                <w:rFonts w:ascii="Arial" w:hAnsi="Arial"/>
+              </w:rPr>
             </w:pPr>
             <w:r>
-              <w:t>Título da Figura. Alinhar o título da figura abaixo da primeira palavra do título quanto este apresentar mais de uma linha como neste exemplo…........…………………………………….......</w:t>
+              <w:rPr>
+                <w:rFonts w:ascii="Arial" w:hAnsi="Arial"/>
+              </w:rPr>
+              <w:t>Tela de resultados – protótipo</w:t>
             </w:r>
           </w:p>
         </w:tc>
@@ -2544,27 +2568,16 @@
           </w:tcPr>
           <w:p>
             <w:pPr>
-              <w:pStyle w:val="Text"/>
-              <w:snapToGrid w:val="0"/>
-              <w:spacing w:before="57" w:after="57"/>
-              <w:ind w:firstLine="0"/>
+              <w:spacing w:line="360" w:lineRule="auto"/>
+              <w:rPr>
+                <w:rFonts w:ascii="Arial" w:hAnsi="Arial"/>
+              </w:rPr>
             </w:pPr>
-          </w:p>
-          <w:p>
-            <w:pPr>
-              <w:pStyle w:val="Text"/>
-              <w:spacing w:before="57" w:after="57"/>
-              <w:ind w:firstLine="0"/>
-            </w:pPr>
-          </w:p>
-          <w:p>
-            <w:pPr>
-              <w:pStyle w:val="Text"/>
-              <w:spacing w:before="57" w:after="57"/>
-              <w:ind w:firstLine="0"/>
-            </w:pPr>
-            <w:r>
-              <w:t>22</w:t>
+            <w:r>
+              <w:rPr>
+                <w:rFonts w:ascii="Arial" w:hAnsi="Arial"/>
+              </w:rPr>
+              <w:t>48</w:t>
             </w:r>
           </w:p>
         </w:tc>
@@ -2575,6 +2588,7 @@
         <w:pStyle w:val="Standard"/>
         <w:rPr>
           <w:color w:val="FF0000"/>
+          <w:szCs w:val="24"/>
         </w:rPr>
       </w:pPr>
     </w:p>
@@ -2607,14 +2621,7 @@
       </w:pPr>
       <w:r>
         <w:lastRenderedPageBreak/>
-        <w:t xml:space="preserve">Lista de Tabelas </w:t>
-      </w:r>
-      <w:r>
-        <w:rPr>
-          <w:b w:val="0"/>
-          <w:color w:val="FF0000"/>
-        </w:rPr>
-        <w:t>(opcional)</w:t>
+        <w:t>LISTA DE TABELAS</w:t>
       </w:r>
     </w:p>
     <w:p>
@@ -2660,7 +2667,7 @@
               <w:ind w:firstLine="0"/>
             </w:pPr>
             <w:r>
-              <w:t xml:space="preserve">Tabela 1 –    </w:t>
+              <w:t>Tabela 1 –</w:t>
             </w:r>
           </w:p>
         </w:tc>
@@ -2681,7 +2688,7 @@
               <w:ind w:firstLine="0"/>
             </w:pPr>
             <w:r>
-              <w:t>Título da Tabela...............................................................................</w:t>
+              <w:t>Tabela de métricas por épocas</w:t>
             </w:r>
           </w:p>
         </w:tc>
@@ -2702,7 +2709,7 @@
               <w:ind w:firstLine="0"/>
             </w:pPr>
             <w:r>
-              <w:t>23</w:t>
+              <w:t>49</w:t>
             </w:r>
           </w:p>
         </w:tc>
@@ -2746,7 +2753,7 @@
               <w:ind w:firstLine="0"/>
             </w:pPr>
             <w:r>
-              <w:t>Título da Tabela...............................................................................</w:t>
+              <w:t>Tabela sobre redução das perdas</w:t>
             </w:r>
           </w:p>
         </w:tc>
@@ -2767,72 +2774,7 @@
               <w:ind w:firstLine="0"/>
             </w:pPr>
             <w:r>
-              <w:t>30</w:t>
-            </w:r>
-          </w:p>
-        </w:tc>
-      </w:tr>
-      <w:tr>
-        <w:tc>
-          <w:tcPr>
-            <w:tcW w:w="1384" w:type="dxa"/>
-            <w:tcMar>
-              <w:top w:w="0" w:type="dxa"/>
-              <w:left w:w="108" w:type="dxa"/>
-              <w:bottom w:w="0" w:type="dxa"/>
-              <w:right w:w="108" w:type="dxa"/>
-            </w:tcMar>
-          </w:tcPr>
-          <w:p>
-            <w:pPr>
-              <w:pStyle w:val="Text"/>
-              <w:spacing w:before="57" w:after="57"/>
-              <w:ind w:firstLine="0"/>
-            </w:pPr>
-            <w:r>
-              <w:t>Tabela 3 –</w:t>
-            </w:r>
-          </w:p>
-        </w:tc>
-        <w:tc>
-          <w:tcPr>
-            <w:tcW w:w="7229" w:type="dxa"/>
-            <w:tcMar>
-              <w:top w:w="0" w:type="dxa"/>
-              <w:left w:w="108" w:type="dxa"/>
-              <w:bottom w:w="0" w:type="dxa"/>
-              <w:right w:w="108" w:type="dxa"/>
-            </w:tcMar>
-          </w:tcPr>
-          <w:p>
-            <w:pPr>
-              <w:pStyle w:val="Text"/>
-              <w:spacing w:before="57" w:after="57"/>
-              <w:ind w:firstLine="0"/>
-            </w:pPr>
-            <w:r>
-              <w:t>Título da Tabela...............................................................................</w:t>
-            </w:r>
-          </w:p>
-        </w:tc>
-        <w:tc>
-          <w:tcPr>
-            <w:tcW w:w="598" w:type="dxa"/>
-            <w:tcMar>
-              <w:top w:w="0" w:type="dxa"/>
-              <w:left w:w="108" w:type="dxa"/>
-              <w:bottom w:w="0" w:type="dxa"/>
-              <w:right w:w="108" w:type="dxa"/>
-            </w:tcMar>
-          </w:tcPr>
-          <w:p>
-            <w:pPr>
-              <w:pStyle w:val="Text"/>
-              <w:spacing w:before="57" w:after="57"/>
-              <w:ind w:firstLine="0"/>
-            </w:pPr>
-            <w:r>
-              <w:t>32</w:t>
+              <w:t>50</w:t>
             </w:r>
           </w:p>
         </w:tc>
@@ -2851,17 +2793,6 @@
     </w:p>
     <w:p>
       <w:pPr>
-        <w:pStyle w:val="Ttulopr-textual"/>
-        <w:rPr>
-          <w:rFonts w:eastAsia="Times New Roman"/>
-          <w:b w:val="0"/>
-          <w:color w:val="FF0000"/>
-          <w:sz w:val="22"/>
-        </w:rPr>
-      </w:pPr>
-    </w:p>
-    <w:p>
-      <w:pPr>
         <w:pStyle w:val="Text"/>
         <w:ind w:firstLine="0"/>
       </w:pPr>
@@ -2873,14 +2804,7 @@
       </w:pPr>
       <w:r>
         <w:lastRenderedPageBreak/>
-        <w:t xml:space="preserve">Lista de siglas </w:t>
-      </w:r>
-      <w:r>
-        <w:rPr>
-          <w:b w:val="0"/>
-          <w:color w:val="FF0000"/>
-        </w:rPr>
-        <w:t>(opcional)</w:t>
+        <w:t>LISTA DE SIGLAS</w:t>
       </w:r>
     </w:p>
     <w:p>
@@ -2889,78 +2813,566 @@
         <w:ind w:firstLine="0"/>
         <w:rPr>
           <w:color w:val="385623"/>
+          <w:szCs w:val="24"/>
         </w:rPr>
       </w:pPr>
     </w:p>
     <w:p>
       <w:pPr>
         <w:pStyle w:val="Text"/>
+        <w:spacing w:line="240" w:lineRule="auto"/>
         <w:ind w:firstLine="0"/>
-      </w:pPr>
-      <w:r>
-        <w:t>SIGLA</w:t>
-      </w:r>
-      <w:r>
+        <w:rPr>
+          <w:szCs w:val="24"/>
+        </w:rPr>
+      </w:pPr>
+      <w:r>
+        <w:rPr>
+          <w:szCs w:val="24"/>
+        </w:rPr>
+        <w:t>API</w:t>
+      </w:r>
+      <w:r>
+        <w:rPr>
+          <w:szCs w:val="24"/>
+        </w:rPr>
         <w:tab/>
       </w:r>
       <w:r>
+        <w:rPr>
+          <w:szCs w:val="24"/>
+        </w:rPr>
         <w:tab/>
-        <w:t>Nome por extenso da Sigla e em ordem alfabética</w:t>
+      </w:r>
+      <w:r>
+        <w:rPr>
+          <w:szCs w:val="24"/>
+        </w:rPr>
+        <w:t>Interface de Programação de Aplicações</w:t>
       </w:r>
     </w:p>
     <w:p>
       <w:pPr>
         <w:pStyle w:val="Text"/>
+        <w:spacing w:line="240" w:lineRule="auto"/>
         <w:ind w:firstLine="0"/>
-      </w:pPr>
-      <w:r>
-        <w:t>SIGLA</w:t>
-      </w:r>
-      <w:r>
+        <w:rPr>
+          <w:szCs w:val="24"/>
+        </w:rPr>
+      </w:pPr>
+      <w:r>
+        <w:rPr>
+          <w:szCs w:val="24"/>
+        </w:rPr>
+        <w:t>ASGI</w:t>
+      </w:r>
+      <w:r>
+        <w:rPr>
+          <w:szCs w:val="24"/>
+        </w:rPr>
         <w:tab/>
       </w:r>
       <w:r>
+        <w:rPr>
+          <w:szCs w:val="24"/>
+        </w:rPr>
         <w:tab/>
-        <w:t>Nome por extenso</w:t>
+      </w:r>
+      <w:r>
+        <w:rPr>
+          <w:szCs w:val="24"/>
+        </w:rPr>
+        <w:t>Interface de Gateway de Servidor Assíncrono</w:t>
       </w:r>
     </w:p>
     <w:p>
       <w:pPr>
         <w:pStyle w:val="Text"/>
+        <w:spacing w:line="240" w:lineRule="auto"/>
         <w:ind w:firstLine="0"/>
-      </w:pPr>
-      <w:r>
-        <w:t>SIGLA</w:t>
-      </w:r>
-      <w:r>
+        <w:rPr>
+          <w:szCs w:val="24"/>
+        </w:rPr>
+      </w:pPr>
+      <w:r>
+        <w:rPr>
+          <w:szCs w:val="24"/>
+        </w:rPr>
+        <w:t>CFM</w:t>
+      </w:r>
+      <w:r>
+        <w:rPr>
+          <w:szCs w:val="24"/>
+        </w:rPr>
         <w:tab/>
       </w:r>
       <w:r>
+        <w:rPr>
+          <w:szCs w:val="24"/>
+        </w:rPr>
         <w:tab/>
-        <w:t>Nome por extenso</w:t>
+      </w:r>
+      <w:r>
+        <w:rPr>
+          <w:szCs w:val="24"/>
+        </w:rPr>
+        <w:t>Conselho Federal de Medicina</w:t>
       </w:r>
     </w:p>
     <w:p>
       <w:pPr>
         <w:pStyle w:val="Text"/>
+        <w:spacing w:line="240" w:lineRule="auto"/>
         <w:ind w:firstLine="0"/>
-      </w:pPr>
-      <w:r>
-        <w:t>SIGLA</w:t>
-      </w:r>
-      <w:r>
+        <w:rPr>
+          <w:szCs w:val="24"/>
+        </w:rPr>
+      </w:pPr>
+      <w:r>
+        <w:rPr>
+          <w:szCs w:val="24"/>
+        </w:rPr>
+        <w:t>CLAHE</w:t>
+      </w:r>
+      <w:r>
+        <w:rPr>
+          <w:szCs w:val="24"/>
+        </w:rPr>
         <w:tab/>
-      </w:r>
-      <w:r>
+        <w:t>Equalização Adaptativa de Histograma com Limitação de Contraste</w:t>
+      </w:r>
+    </w:p>
+    <w:p>
+      <w:pPr>
+        <w:rPr>
+          <w:rFonts w:ascii="Arial" w:hAnsi="Arial"/>
+        </w:rPr>
+      </w:pPr>
+      <w:r>
+        <w:rPr>
+          <w:rFonts w:ascii="Arial" w:hAnsi="Arial"/>
+        </w:rPr>
+        <w:t>CNN</w:t>
+      </w:r>
+      <w:r>
+        <w:rPr>
+          <w:rFonts w:ascii="Arial" w:hAnsi="Arial"/>
+        </w:rPr>
         <w:tab/>
-        <w:t>Nome por extenso</w:t>
-      </w:r>
-    </w:p>
-    <w:p>
-      <w:pPr>
-        <w:pStyle w:val="Text"/>
-        <w:ind w:firstLine="0"/>
-      </w:pPr>
+      </w:r>
+      <w:r>
+        <w:rPr>
+          <w:rFonts w:ascii="Arial" w:hAnsi="Arial"/>
+        </w:rPr>
+        <w:tab/>
+      </w:r>
+      <w:r>
+        <w:rPr>
+          <w:rFonts w:ascii="Arial" w:hAnsi="Arial"/>
+        </w:rPr>
+        <w:t>Rede Neural Convolucional</w:t>
+      </w:r>
+    </w:p>
+    <w:p>
+      <w:pPr>
+        <w:rPr>
+          <w:rFonts w:ascii="Arial" w:hAnsi="Arial"/>
+        </w:rPr>
+      </w:pPr>
+      <w:r>
+        <w:rPr>
+          <w:rFonts w:ascii="Arial" w:hAnsi="Arial"/>
+        </w:rPr>
+        <w:t>CPU</w:t>
+      </w:r>
+      <w:r>
+        <w:rPr>
+          <w:rFonts w:ascii="Arial" w:hAnsi="Arial"/>
+        </w:rPr>
+        <w:tab/>
+      </w:r>
+      <w:r>
+        <w:rPr>
+          <w:rFonts w:ascii="Arial" w:hAnsi="Arial"/>
+        </w:rPr>
+        <w:tab/>
+      </w:r>
+      <w:r>
+        <w:rPr>
+          <w:rFonts w:ascii="Arial" w:hAnsi="Arial"/>
+        </w:rPr>
+        <w:t>Unidade Central de Processamento</w:t>
+      </w:r>
+    </w:p>
+    <w:p>
+      <w:pPr>
+        <w:rPr>
+          <w:rFonts w:ascii="Arial" w:hAnsi="Arial"/>
+        </w:rPr>
+      </w:pPr>
+      <w:r>
+        <w:rPr>
+          <w:rFonts w:ascii="Arial" w:hAnsi="Arial"/>
+        </w:rPr>
+        <w:t>CSS</w:t>
+      </w:r>
+      <w:r>
+        <w:rPr>
+          <w:rFonts w:ascii="Arial" w:hAnsi="Arial"/>
+        </w:rPr>
+        <w:tab/>
+      </w:r>
+      <w:r>
+        <w:rPr>
+          <w:rFonts w:ascii="Arial" w:hAnsi="Arial"/>
+        </w:rPr>
+        <w:tab/>
+      </w:r>
+      <w:r>
+        <w:rPr>
+          <w:rFonts w:ascii="Arial" w:hAnsi="Arial"/>
+        </w:rPr>
+        <w:t>Folhas de Estilo em Cascata</w:t>
+      </w:r>
+    </w:p>
+    <w:p>
+      <w:pPr>
+        <w:rPr>
+          <w:rFonts w:ascii="Arial" w:hAnsi="Arial"/>
+        </w:rPr>
+      </w:pPr>
+      <w:r>
+        <w:rPr>
+          <w:rFonts w:ascii="Arial" w:hAnsi="Arial"/>
+        </w:rPr>
+        <w:t>CSV</w:t>
+      </w:r>
+      <w:r>
+        <w:rPr>
+          <w:rFonts w:ascii="Arial" w:hAnsi="Arial"/>
+        </w:rPr>
+        <w:tab/>
+      </w:r>
+      <w:r>
+        <w:rPr>
+          <w:rFonts w:ascii="Arial" w:hAnsi="Arial"/>
+        </w:rPr>
+        <w:tab/>
+      </w:r>
+      <w:r>
+        <w:rPr>
+          <w:rFonts w:ascii="Arial" w:hAnsi="Arial"/>
+        </w:rPr>
+        <w:t>Valores Separados por Vírgulas</w:t>
+      </w:r>
+    </w:p>
+    <w:p>
+      <w:pPr>
+        <w:rPr>
+          <w:rFonts w:ascii="Arial" w:hAnsi="Arial"/>
+        </w:rPr>
+      </w:pPr>
+      <w:r>
+        <w:rPr>
+          <w:rFonts w:ascii="Arial" w:hAnsi="Arial"/>
+        </w:rPr>
+        <w:t>DFL</w:t>
+      </w:r>
+      <w:r>
+        <w:rPr>
+          <w:rFonts w:ascii="Arial" w:hAnsi="Arial"/>
+        </w:rPr>
+        <w:tab/>
+      </w:r>
+      <w:r>
+        <w:rPr>
+          <w:rFonts w:ascii="Arial" w:hAnsi="Arial"/>
+        </w:rPr>
+        <w:tab/>
+      </w:r>
+      <w:proofErr w:type="spellStart"/>
+      <w:r>
+        <w:rPr>
+          <w:rFonts w:ascii="Arial" w:hAnsi="Arial"/>
+        </w:rPr>
+        <w:t>Distribution</w:t>
+      </w:r>
+      <w:proofErr w:type="spellEnd"/>
+      <w:r>
+        <w:rPr>
+          <w:rFonts w:ascii="Arial" w:hAnsi="Arial"/>
+        </w:rPr>
+        <w:t xml:space="preserve"> Focal </w:t>
+      </w:r>
+      <w:proofErr w:type="spellStart"/>
+      <w:r>
+        <w:rPr>
+          <w:rFonts w:ascii="Arial" w:hAnsi="Arial"/>
+        </w:rPr>
+        <w:t>Loss</w:t>
+      </w:r>
+      <w:proofErr w:type="spellEnd"/>
+    </w:p>
+    <w:p>
+      <w:pPr>
+        <w:rPr>
+          <w:rFonts w:ascii="Arial" w:hAnsi="Arial"/>
+        </w:rPr>
+      </w:pPr>
+      <w:r>
+        <w:rPr>
+          <w:rFonts w:ascii="Arial" w:hAnsi="Arial"/>
+        </w:rPr>
+        <w:t>GPU</w:t>
+      </w:r>
+      <w:r>
+        <w:rPr>
+          <w:rFonts w:ascii="Arial" w:hAnsi="Arial"/>
+        </w:rPr>
+        <w:tab/>
+      </w:r>
+      <w:r>
+        <w:rPr>
+          <w:rFonts w:ascii="Arial" w:hAnsi="Arial"/>
+        </w:rPr>
+        <w:tab/>
+      </w:r>
+      <w:r>
+        <w:rPr>
+          <w:rFonts w:ascii="Arial" w:hAnsi="Arial"/>
+        </w:rPr>
+        <w:t>Unidade de Processamento Gráfico</w:t>
+      </w:r>
+    </w:p>
+    <w:p>
+      <w:pPr>
+        <w:rPr>
+          <w:rFonts w:ascii="Arial" w:hAnsi="Arial"/>
+        </w:rPr>
+      </w:pPr>
+      <w:r>
+        <w:rPr>
+          <w:rFonts w:ascii="Arial" w:hAnsi="Arial"/>
+        </w:rPr>
+        <w:t>HTML</w:t>
+      </w:r>
+      <w:r>
+        <w:rPr>
+          <w:rFonts w:ascii="Arial" w:hAnsi="Arial"/>
+        </w:rPr>
+        <w:tab/>
+      </w:r>
+      <w:r>
+        <w:rPr>
+          <w:rFonts w:ascii="Arial" w:hAnsi="Arial"/>
+        </w:rPr>
+        <w:tab/>
+      </w:r>
+      <w:r>
+        <w:rPr>
+          <w:rFonts w:ascii="Arial" w:hAnsi="Arial"/>
+        </w:rPr>
+        <w:t>Linguagem de Marcação de Hipertexto</w:t>
+      </w:r>
+    </w:p>
+    <w:p>
+      <w:pPr>
+        <w:rPr>
+          <w:rFonts w:ascii="Arial" w:hAnsi="Arial"/>
+        </w:rPr>
+      </w:pPr>
+      <w:r>
+        <w:rPr>
+          <w:rFonts w:ascii="Arial" w:hAnsi="Arial"/>
+        </w:rPr>
+        <w:t>HTTP</w:t>
+      </w:r>
+      <w:r>
+        <w:rPr>
+          <w:rFonts w:ascii="Arial" w:hAnsi="Arial"/>
+        </w:rPr>
+        <w:tab/>
+      </w:r>
+      <w:r>
+        <w:rPr>
+          <w:rFonts w:ascii="Arial" w:hAnsi="Arial"/>
+        </w:rPr>
+        <w:tab/>
+      </w:r>
+      <w:r>
+        <w:rPr>
+          <w:rFonts w:ascii="Arial" w:hAnsi="Arial"/>
+        </w:rPr>
+        <w:t>Protocolo de Transferência de Hipertexto</w:t>
+      </w:r>
+    </w:p>
+    <w:p>
+      <w:pPr>
+        <w:rPr>
+          <w:rFonts w:ascii="Arial" w:hAnsi="Arial"/>
+        </w:rPr>
+      </w:pPr>
+      <w:r>
+        <w:rPr>
+          <w:rFonts w:ascii="Arial" w:hAnsi="Arial"/>
+        </w:rPr>
+        <w:t>IA</w:t>
+      </w:r>
+      <w:r>
+        <w:rPr>
+          <w:rFonts w:ascii="Arial" w:hAnsi="Arial"/>
+        </w:rPr>
+        <w:tab/>
+      </w:r>
+      <w:r>
+        <w:rPr>
+          <w:rFonts w:ascii="Arial" w:hAnsi="Arial"/>
+        </w:rPr>
+        <w:tab/>
+      </w:r>
+      <w:r>
+        <w:rPr>
+          <w:rFonts w:ascii="Arial" w:hAnsi="Arial"/>
+        </w:rPr>
+        <w:t>Inteligência Artificial</w:t>
+      </w:r>
+    </w:p>
+    <w:p>
+      <w:pPr>
+        <w:rPr>
+          <w:rFonts w:ascii="Arial" w:hAnsi="Arial"/>
+        </w:rPr>
+      </w:pPr>
+      <w:r>
+        <w:rPr>
+          <w:rFonts w:ascii="Arial" w:hAnsi="Arial"/>
+        </w:rPr>
+        <w:t>JSON</w:t>
+      </w:r>
+      <w:r>
+        <w:rPr>
+          <w:rFonts w:ascii="Arial" w:hAnsi="Arial"/>
+        </w:rPr>
+        <w:tab/>
+      </w:r>
+      <w:r>
+        <w:rPr>
+          <w:rFonts w:ascii="Arial" w:hAnsi="Arial"/>
+        </w:rPr>
+        <w:tab/>
+      </w:r>
+      <w:r>
+        <w:rPr>
+          <w:rFonts w:ascii="Arial" w:hAnsi="Arial"/>
+        </w:rPr>
+        <w:t xml:space="preserve">Notação de Objetos </w:t>
+      </w:r>
+      <w:proofErr w:type="spellStart"/>
+      <w:r>
+        <w:rPr>
+          <w:rFonts w:ascii="Arial" w:hAnsi="Arial"/>
+        </w:rPr>
+        <w:t>JavaScript</w:t>
+      </w:r>
+      <w:proofErr w:type="spellEnd"/>
+    </w:p>
+    <w:p>
+      <w:pPr>
+        <w:rPr>
+          <w:rFonts w:ascii="Arial" w:hAnsi="Arial"/>
+        </w:rPr>
+      </w:pPr>
+      <w:r>
+        <w:rPr>
+          <w:rFonts w:ascii="Arial" w:hAnsi="Arial"/>
+        </w:rPr>
+        <w:t>PNG</w:t>
+      </w:r>
+      <w:r>
+        <w:rPr>
+          <w:rFonts w:ascii="Arial" w:hAnsi="Arial"/>
+        </w:rPr>
+        <w:tab/>
+      </w:r>
+      <w:r>
+        <w:rPr>
+          <w:rFonts w:ascii="Arial" w:hAnsi="Arial"/>
+        </w:rPr>
+        <w:tab/>
+      </w:r>
+      <w:r>
+        <w:rPr>
+          <w:rFonts w:ascii="Arial" w:hAnsi="Arial"/>
+        </w:rPr>
+        <w:t>Gráficos de Rede Portáteis</w:t>
+      </w:r>
+    </w:p>
+    <w:p>
+      <w:pPr>
+        <w:rPr>
+          <w:rFonts w:ascii="Arial" w:hAnsi="Arial"/>
+        </w:rPr>
+      </w:pPr>
+      <w:r>
+        <w:rPr>
+          <w:rFonts w:ascii="Arial" w:hAnsi="Arial"/>
+        </w:rPr>
+        <w:t>RGB</w:t>
+      </w:r>
+      <w:r>
+        <w:rPr>
+          <w:rFonts w:ascii="Arial" w:hAnsi="Arial"/>
+        </w:rPr>
+        <w:tab/>
+      </w:r>
+      <w:r>
+        <w:rPr>
+          <w:rFonts w:ascii="Arial" w:hAnsi="Arial"/>
+        </w:rPr>
+        <w:tab/>
+      </w:r>
+      <w:r>
+        <w:rPr>
+          <w:rFonts w:ascii="Arial" w:hAnsi="Arial"/>
+        </w:rPr>
+        <w:t>Vermelho, Verde e Azul</w:t>
+      </w:r>
+    </w:p>
+    <w:p>
+      <w:pPr>
+        <w:rPr>
+          <w:rFonts w:ascii="Arial" w:hAnsi="Arial"/>
+          <w:lang w:val="en-US"/>
+        </w:rPr>
+      </w:pPr>
+      <w:r>
+        <w:rPr>
+          <w:rFonts w:ascii="Arial" w:hAnsi="Arial"/>
+          <w:lang w:val="en-US"/>
+        </w:rPr>
+        <w:t>YOLO</w:t>
+      </w:r>
+      <w:r>
+        <w:rPr>
+          <w:rFonts w:ascii="Arial" w:hAnsi="Arial"/>
+          <w:lang w:val="en-US"/>
+        </w:rPr>
+        <w:tab/>
+      </w:r>
+      <w:r>
+        <w:rPr>
+          <w:rFonts w:ascii="Arial" w:hAnsi="Arial"/>
+          <w:lang w:val="en-US"/>
+        </w:rPr>
+        <w:tab/>
+      </w:r>
+      <w:r>
+        <w:rPr>
+          <w:rFonts w:ascii="Arial" w:hAnsi="Arial"/>
+          <w:lang w:val="en-US"/>
+        </w:rPr>
+        <w:t>You Only Look Once</w:t>
+      </w:r>
     </w:p>
     <w:p>
       <w:pPr>
@@ -19440,342 +19852,112 @@
     <w:p>
       <w:pPr>
         <w:pStyle w:val="Text"/>
-      </w:pPr>
-      <w:r>
-        <w:t>Última sessão do texto onde são apresentados os desfechos finais da pesquisa, correspondentes aos objetivos ou hipóteses. É importante apresentar novas ideias, abrindo caminho a outros pesquisadores que poderão trabalhar no assunto.</w:t>
+        <w:spacing w:after="120"/>
+        <w:ind w:firstLine="709"/>
+      </w:pPr>
+      <w:r>
+        <w:t>O presente trabalho teve como objetivo desenvolver e avaliar um sistema computacional de apoio à identificação de fraturas em imagens radiográficas do punho, utilizando técnicas de Inteligência Artificial e visão computacional. Ao longo do desenvolvimento, foram realizadas etapas de estudo bibliográfico, preparação de dados, implementação e treinamento de modelos, avaliação de desempenho e integração dos componentes da aplicação. A construção do sistema permitiu relacionar os fundamentos teóricos de redes neurais convolucionais a uma solução prática voltada à análise automatizada de radiografias.</w:t>
       </w:r>
     </w:p>
     <w:p>
       <w:pPr>
         <w:pStyle w:val="Text"/>
-      </w:pPr>
-      <w:r>
-        <w:t xml:space="preserve">Texto </w:t>
-      </w:r>
-      <w:proofErr w:type="spellStart"/>
-      <w:proofErr w:type="gramStart"/>
-      <w:r>
-        <w:t>texto</w:t>
-      </w:r>
-      <w:proofErr w:type="spellEnd"/>
-      <w:proofErr w:type="gramEnd"/>
-      <w:r>
-        <w:t xml:space="preserve"> </w:t>
-      </w:r>
-      <w:proofErr w:type="spellStart"/>
-      <w:r>
-        <w:t>texto</w:t>
-      </w:r>
-      <w:proofErr w:type="spellEnd"/>
-      <w:r>
-        <w:t xml:space="preserve"> </w:t>
-      </w:r>
-      <w:proofErr w:type="spellStart"/>
-      <w:proofErr w:type="gramStart"/>
-      <w:r>
-        <w:t>texto</w:t>
-      </w:r>
-      <w:proofErr w:type="spellEnd"/>
-      <w:proofErr w:type="gramEnd"/>
-      <w:r>
-        <w:t xml:space="preserve"> </w:t>
-      </w:r>
-      <w:proofErr w:type="spellStart"/>
-      <w:r>
-        <w:t>texto</w:t>
-      </w:r>
-      <w:proofErr w:type="spellEnd"/>
-      <w:r>
-        <w:t xml:space="preserve"> </w:t>
-      </w:r>
-      <w:proofErr w:type="spellStart"/>
-      <w:proofErr w:type="gramStart"/>
-      <w:r>
-        <w:t>texto</w:t>
-      </w:r>
-      <w:proofErr w:type="spellEnd"/>
-      <w:proofErr w:type="gramEnd"/>
-      <w:r>
-        <w:t xml:space="preserve"> </w:t>
-      </w:r>
-      <w:proofErr w:type="spellStart"/>
-      <w:r>
-        <w:t>texto</w:t>
-      </w:r>
-      <w:proofErr w:type="spellEnd"/>
-      <w:r>
-        <w:t xml:space="preserve"> </w:t>
-      </w:r>
-      <w:proofErr w:type="spellStart"/>
-      <w:proofErr w:type="gramStart"/>
-      <w:r>
-        <w:t>texto</w:t>
-      </w:r>
-      <w:proofErr w:type="spellEnd"/>
-      <w:proofErr w:type="gramEnd"/>
-      <w:r>
-        <w:t xml:space="preserve"> </w:t>
-      </w:r>
-      <w:proofErr w:type="spellStart"/>
-      <w:r>
-        <w:t>texto</w:t>
-      </w:r>
-      <w:proofErr w:type="spellEnd"/>
-      <w:r>
-        <w:t xml:space="preserve"> </w:t>
-      </w:r>
-      <w:proofErr w:type="spellStart"/>
-      <w:proofErr w:type="gramStart"/>
-      <w:r>
-        <w:t>texto</w:t>
-      </w:r>
-      <w:proofErr w:type="spellEnd"/>
-      <w:proofErr w:type="gramEnd"/>
-      <w:r>
-        <w:t xml:space="preserve"> </w:t>
-      </w:r>
-      <w:proofErr w:type="spellStart"/>
-      <w:r>
-        <w:t>texto</w:t>
-      </w:r>
-      <w:proofErr w:type="spellEnd"/>
-      <w:r>
-        <w:t xml:space="preserve"> </w:t>
-      </w:r>
-      <w:proofErr w:type="spellStart"/>
-      <w:proofErr w:type="gramStart"/>
-      <w:r>
-        <w:t>texto</w:t>
-      </w:r>
-      <w:proofErr w:type="spellEnd"/>
-      <w:proofErr w:type="gramEnd"/>
-      <w:r>
-        <w:t xml:space="preserve"> </w:t>
-      </w:r>
-      <w:proofErr w:type="spellStart"/>
-      <w:r>
-        <w:t>texto</w:t>
-      </w:r>
-      <w:proofErr w:type="spellEnd"/>
-      <w:r>
-        <w:t xml:space="preserve"> </w:t>
-      </w:r>
-      <w:proofErr w:type="spellStart"/>
-      <w:proofErr w:type="gramStart"/>
-      <w:r>
-        <w:t>texto</w:t>
-      </w:r>
-      <w:proofErr w:type="spellEnd"/>
-      <w:proofErr w:type="gramEnd"/>
-      <w:r>
-        <w:t xml:space="preserve"> </w:t>
-      </w:r>
-      <w:proofErr w:type="spellStart"/>
-      <w:r>
-        <w:t>texto</w:t>
-      </w:r>
-      <w:proofErr w:type="spellEnd"/>
-      <w:r>
-        <w:t xml:space="preserve"> </w:t>
-      </w:r>
-      <w:proofErr w:type="spellStart"/>
-      <w:proofErr w:type="gramStart"/>
-      <w:r>
-        <w:t>texto</w:t>
-      </w:r>
-      <w:proofErr w:type="spellEnd"/>
-      <w:proofErr w:type="gramEnd"/>
-      <w:r>
-        <w:t xml:space="preserve"> </w:t>
-      </w:r>
-      <w:proofErr w:type="spellStart"/>
-      <w:r>
-        <w:t>texto</w:t>
-      </w:r>
-      <w:proofErr w:type="spellEnd"/>
-      <w:r>
-        <w:t xml:space="preserve"> </w:t>
-      </w:r>
-      <w:proofErr w:type="spellStart"/>
-      <w:proofErr w:type="gramStart"/>
-      <w:r>
-        <w:t>texto</w:t>
-      </w:r>
-      <w:proofErr w:type="spellEnd"/>
-      <w:proofErr w:type="gramEnd"/>
-      <w:r>
-        <w:t xml:space="preserve"> </w:t>
-      </w:r>
-      <w:proofErr w:type="spellStart"/>
-      <w:r>
-        <w:t>texto</w:t>
-      </w:r>
-      <w:proofErr w:type="spellEnd"/>
-      <w:r>
-        <w:t xml:space="preserve"> </w:t>
-      </w:r>
-      <w:proofErr w:type="spellStart"/>
-      <w:proofErr w:type="gramStart"/>
-      <w:r>
-        <w:t>texto</w:t>
-      </w:r>
-      <w:proofErr w:type="spellEnd"/>
-      <w:proofErr w:type="gramEnd"/>
-      <w:r>
-        <w:t xml:space="preserve"> </w:t>
-      </w:r>
-      <w:proofErr w:type="spellStart"/>
-      <w:r>
-        <w:t>texto</w:t>
-      </w:r>
-      <w:proofErr w:type="spellEnd"/>
-      <w:r>
-        <w:t xml:space="preserve"> </w:t>
-      </w:r>
-      <w:proofErr w:type="spellStart"/>
-      <w:proofErr w:type="gramStart"/>
-      <w:r>
-        <w:t>texto</w:t>
-      </w:r>
-      <w:proofErr w:type="spellEnd"/>
-      <w:proofErr w:type="gramEnd"/>
-      <w:r>
-        <w:t xml:space="preserve"> </w:t>
-      </w:r>
-      <w:proofErr w:type="spellStart"/>
-      <w:r>
-        <w:t>texto</w:t>
-      </w:r>
-      <w:proofErr w:type="spellEnd"/>
-      <w:r>
-        <w:t xml:space="preserve"> </w:t>
-      </w:r>
-      <w:proofErr w:type="spellStart"/>
-      <w:proofErr w:type="gramStart"/>
-      <w:r>
-        <w:t>texto</w:t>
-      </w:r>
-      <w:proofErr w:type="spellEnd"/>
-      <w:proofErr w:type="gramEnd"/>
-      <w:r>
-        <w:t xml:space="preserve"> </w:t>
-      </w:r>
-      <w:proofErr w:type="spellStart"/>
-      <w:r>
-        <w:t>texto</w:t>
-      </w:r>
-      <w:proofErr w:type="spellEnd"/>
-      <w:r>
-        <w:t xml:space="preserve"> </w:t>
-      </w:r>
-      <w:proofErr w:type="spellStart"/>
-      <w:proofErr w:type="gramStart"/>
-      <w:r>
-        <w:t>texto</w:t>
-      </w:r>
-      <w:proofErr w:type="spellEnd"/>
-      <w:proofErr w:type="gramEnd"/>
-      <w:r>
-        <w:t xml:space="preserve"> </w:t>
-      </w:r>
-      <w:proofErr w:type="spellStart"/>
-      <w:r>
-        <w:t>texto</w:t>
-      </w:r>
-      <w:proofErr w:type="spellEnd"/>
-      <w:r>
-        <w:t xml:space="preserve"> </w:t>
-      </w:r>
-      <w:proofErr w:type="spellStart"/>
-      <w:proofErr w:type="gramStart"/>
-      <w:r>
-        <w:t>texto</w:t>
-      </w:r>
-      <w:proofErr w:type="spellEnd"/>
-      <w:proofErr w:type="gramEnd"/>
-      <w:r>
-        <w:t xml:space="preserve"> </w:t>
-      </w:r>
-      <w:proofErr w:type="spellStart"/>
-      <w:r>
-        <w:t>texto</w:t>
-      </w:r>
-      <w:proofErr w:type="spellEnd"/>
-      <w:r>
-        <w:t xml:space="preserve"> </w:t>
-      </w:r>
-      <w:proofErr w:type="spellStart"/>
-      <w:proofErr w:type="gramStart"/>
-      <w:r>
-        <w:t>texto</w:t>
-      </w:r>
-      <w:proofErr w:type="spellEnd"/>
-      <w:proofErr w:type="gramEnd"/>
-      <w:r>
-        <w:t xml:space="preserve"> </w:t>
-      </w:r>
-      <w:proofErr w:type="spellStart"/>
-      <w:r>
-        <w:t>texto</w:t>
-      </w:r>
-      <w:proofErr w:type="spellEnd"/>
-      <w:r>
-        <w:t xml:space="preserve"> </w:t>
-      </w:r>
-      <w:proofErr w:type="spellStart"/>
-      <w:proofErr w:type="gramStart"/>
-      <w:r>
-        <w:t>texto</w:t>
-      </w:r>
-      <w:proofErr w:type="spellEnd"/>
-      <w:proofErr w:type="gramEnd"/>
-      <w:r>
-        <w:t xml:space="preserve"> </w:t>
-      </w:r>
-      <w:proofErr w:type="spellStart"/>
-      <w:r>
-        <w:t>texto</w:t>
-      </w:r>
-      <w:proofErr w:type="spellEnd"/>
-      <w:r>
-        <w:t xml:space="preserve"> </w:t>
-      </w:r>
-      <w:proofErr w:type="spellStart"/>
-      <w:proofErr w:type="gramStart"/>
-      <w:r>
-        <w:t>texto</w:t>
-      </w:r>
-      <w:proofErr w:type="spellEnd"/>
-      <w:proofErr w:type="gramEnd"/>
-      <w:r>
-        <w:t xml:space="preserve"> </w:t>
-      </w:r>
-      <w:proofErr w:type="spellStart"/>
-      <w:r>
-        <w:t>texto</w:t>
-      </w:r>
-      <w:proofErr w:type="spellEnd"/>
-      <w:r>
-        <w:t xml:space="preserve"> </w:t>
-      </w:r>
-      <w:proofErr w:type="spellStart"/>
-      <w:proofErr w:type="gramStart"/>
-      <w:r>
-        <w:t>texto</w:t>
-      </w:r>
-      <w:proofErr w:type="spellEnd"/>
-      <w:proofErr w:type="gramEnd"/>
-      <w:r>
-        <w:t xml:space="preserve"> </w:t>
-      </w:r>
-      <w:proofErr w:type="spellStart"/>
-      <w:r>
-        <w:t>texto</w:t>
-      </w:r>
-      <w:proofErr w:type="spellEnd"/>
-      <w:r>
-        <w:t>.</w:t>
-      </w:r>
+        <w:spacing w:after="120"/>
+        <w:ind w:firstLine="709"/>
+      </w:pPr>
+      <w:r>
+        <w:t xml:space="preserve">A metodologia passou por uma evolução importante. A proposta inicial, baseada em uma rede neural convolucional desenvolvida para classificação binária, foi reformulada em favor de um modelo de detecção de objetos, o YOLO11n, com aproveitamento de pesos </w:t>
+      </w:r>
+      <w:proofErr w:type="spellStart"/>
+      <w:r>
+        <w:t>pré</w:t>
+      </w:r>
+      <w:proofErr w:type="spellEnd"/>
+      <w:r>
+        <w:t xml:space="preserve">-treinados. Essa mudança tornou possível não apenas indicar a presença de possíveis fraturas, mas também localizar regiões suspeitas nas imagens por meio de caixas delimitadoras. O uso do conjunto de dados GRAZPEDWRI-DX e dos recursos disponibilizados pela </w:t>
+      </w:r>
+      <w:proofErr w:type="spellStart"/>
+      <w:r>
+        <w:t>Ultralytics</w:t>
+      </w:r>
+      <w:proofErr w:type="spellEnd"/>
+      <w:r>
+        <w:t xml:space="preserve"> viabilizou a adaptação do modelo ao problema investigado.</w:t>
+      </w:r>
+    </w:p>
+    <w:p>
+      <w:pPr>
+        <w:pStyle w:val="Text"/>
+        <w:spacing w:after="120"/>
+        <w:ind w:firstLine="709"/>
+      </w:pPr>
+      <w:r>
+        <w:t xml:space="preserve">Os resultados apresentados demonstram uma evolução do desempenho ao longo do treinamento. Na trigésima época, foram registrados valores de precisão de 0,916, recall de 0,84354, mAP@50 de 0,92668 e mAP@50–95 de 0,51941. Esses indicadores apontam a capacidade do modelo de identificar e localizar padrões associados às fraturas no conjunto de dados avaliado, embora a diferença entre as métricas de </w:t>
+      </w:r>
+      <w:proofErr w:type="spellStart"/>
+      <w:r>
+        <w:t>mAP</w:t>
+      </w:r>
+      <w:proofErr w:type="spellEnd"/>
+      <w:r>
+        <w:t xml:space="preserve"> também evidencie dificuldades na obtenção de localizações mais rigorosas. Dessa forma, os resultados devem ser interpretados dentro das condições experimentais descritas, sem serem confundidos com comprovação de eficácia diagnóstica em ambiente clínico.</w:t>
+      </w:r>
+    </w:p>
+    <w:p>
+      <w:pPr>
+        <w:pStyle w:val="Text"/>
+        <w:spacing w:after="120"/>
+        <w:ind w:firstLine="709"/>
+      </w:pPr>
+      <w:r>
+        <w:t xml:space="preserve">Além do treinamento do modelo, foi desenvolvida uma aplicação composta por uma API implementada com </w:t>
+      </w:r>
+      <w:proofErr w:type="spellStart"/>
+      <w:r>
+        <w:t>FastAPI</w:t>
+      </w:r>
+      <w:proofErr w:type="spellEnd"/>
+      <w:r>
+        <w:t xml:space="preserve"> e uma interface em </w:t>
+      </w:r>
+      <w:proofErr w:type="spellStart"/>
+      <w:r>
+        <w:t>Streamlit</w:t>
+      </w:r>
+      <w:proofErr w:type="spellEnd"/>
+      <w:r>
+        <w:t xml:space="preserve">. Essa estrutura possibilita o envio de radiografias, a execução das predições e a apresentação de imagens com as regiões detectadas, acompanhadas das informações de confiança e da quantidade de ocorrências identificadas. A integração entre esses componentes constitui uma contribuição prática do projeto, ao </w:t>
+      </w:r>
+      <w:r>
+        <w:lastRenderedPageBreak/>
+        <w:t>transformar os resultados do modelo em informações acessíveis por meio de uma interface de utilização.</w:t>
+      </w:r>
+    </w:p>
+    <w:p>
+      <w:pPr>
+        <w:pStyle w:val="Text"/>
+        <w:spacing w:after="120"/>
+        <w:ind w:firstLine="709"/>
+      </w:pPr>
+      <w:r>
+        <w:t>Entretanto, o sistema apresenta limitações que precisam ser consideradas. O conjunto de dados utilizado é voltado a radiografias de punho pediátrico, o que restringe a extrapolação dos resultados para outras populações e condições de aquisição. Também são necessárias avaliações adicionais com dados externos, análise de erros e acompanhamento de profissionais especializados para verificar a consistência das predições em cenários distintos. Portanto, a aplicação desenvolvida deve ser compreendida como um protótipo experimental de apoio à análise de imagens, e não como substituto do diagnóstico realizado por profissionais da saúde.</w:t>
+      </w:r>
+    </w:p>
+    <w:p>
+      <w:pPr>
+        <w:pStyle w:val="Text"/>
+        <w:spacing w:after="120"/>
+        <w:ind w:firstLine="709"/>
+      </w:pPr>
+      <w:r>
+        <w:t>Como possibilidades para trabalhos futuros, destacam-se a ampliação e diversificação dos conjuntos de dados, o aperfeiçoamento das anotações, a comparação com outras arquiteturas de detecção, a investigação de estratégias para reduzir falsos positivos e falsos negativos e a realização de estudos de validação externa com participação de especialistas. Conclui-se que os objetivos de desenvolvimento e avaliação experimental de uma ferramenta de apoio foram contemplados, evidenciando o potencial da Inteligência Artificial na análise de radiografias do punho, ao mesmo tempo em que se reconhece a necessidade de validação criteriosa antes de qualquer utilização clínica.</w:t>
+      </w:r>
+    </w:p>
+    <w:p>
+      <w:pPr>
+        <w:pStyle w:val="Text"/>
+        <w:ind w:firstLine="0"/>
+      </w:pPr>
     </w:p>
     <w:p>
       <w:pPr>
@@ -19807,7 +19989,7 @@
         <w:jc w:val="both"/>
         <w:rPr>
           <w:rFonts w:ascii="Arial" w:hAnsi="Arial"/>
-          <w:lang w:bidi="ar-SA"/>
+          <w:lang w:val="en-US" w:bidi="ar-SA"/>
         </w:rPr>
       </w:pPr>
       <w:r>
@@ -19868,7 +20050,7 @@
       <w:r>
         <w:rPr>
           <w:rFonts w:ascii="Arial" w:hAnsi="Arial"/>
-          <w:lang w:bidi="ar-SA"/>
+          <w:lang w:val="en-US" w:bidi="ar-SA"/>
         </w:rPr>
         <w:t>DOI: 10.1590/S1413-78522009000300011.</w:t>
       </w:r>
@@ -19879,7 +20061,7 @@
         <w:jc w:val="both"/>
         <w:rPr>
           <w:rFonts w:ascii="Arial" w:hAnsi="Arial"/>
-          <w:lang w:bidi="ar-SA"/>
+          <w:lang w:val="en-US" w:bidi="ar-SA"/>
         </w:rPr>
       </w:pPr>
     </w:p>
@@ -20945,7 +21127,7 @@
       <w:r>
         <w:rPr>
           <w:rFonts w:ascii="Arial" w:hAnsi="Arial"/>
-          <w:lang w:bidi="ar-SA"/>
+          <w:lang w:val="en-US" w:bidi="ar-SA"/>
         </w:rPr>
         <w:t xml:space="preserve">SAFITRI, </w:t>
       </w:r>
@@ -20953,7 +21135,7 @@
       <w:r>
         <w:rPr>
           <w:rFonts w:ascii="Arial" w:hAnsi="Arial"/>
-          <w:lang w:bidi="ar-SA"/>
+          <w:lang w:val="en-US" w:bidi="ar-SA"/>
         </w:rPr>
         <w:t>Aprilyani</w:t>
       </w:r>
@@ -20961,25 +21143,9 @@
       <w:r>
         <w:rPr>
           <w:rFonts w:ascii="Arial" w:hAnsi="Arial"/>
-          <w:lang w:bidi="ar-SA"/>
-        </w:rPr>
-        <w:t xml:space="preserve"> Nur; HARKESPAN, </w:t>
-      </w:r>
-      <w:proofErr w:type="spellStart"/>
-      <w:r>
-        <w:rPr>
-          <w:rFonts w:ascii="Arial" w:hAnsi="Arial"/>
-          <w:lang w:bidi="ar-SA"/>
-        </w:rPr>
-        <w:t>Imanuel</w:t>
-      </w:r>
-      <w:proofErr w:type="spellEnd"/>
-      <w:r>
-        <w:rPr>
-          <w:rFonts w:ascii="Arial" w:hAnsi="Arial"/>
-          <w:lang w:bidi="ar-SA"/>
-        </w:rPr>
-        <w:t xml:space="preserve">. </w:t>
+          <w:lang w:val="en-US" w:bidi="ar-SA"/>
+        </w:rPr>
+        <w:t xml:space="preserve"> Nur; HARKESPAN, Imanuel. </w:t>
       </w:r>
       <w:proofErr w:type="spellStart"/>
       <w:r>

</xml_diff>